<commit_message>
Started work on LibTorch.
</commit_message>
<xml_diff>
--- a/Word/1.docx
+++ b/Word/1.docx
@@ -2444,6 +2444,186 @@
       </w:r>
     </w:p>
     <w:p/>
+    <w:p>
+      <w:proofErr w:type="spellStart"/>
+      <w:r>
+        <w:t>PyTorch</w:t>
+      </w:r>
+      <w:proofErr w:type="spellEnd"/>
+      <w:r>
+        <w:t xml:space="preserve"> je </w:t>
+      </w:r>
+      <w:proofErr w:type="spellStart"/>
+      <w:r>
+        <w:t>Python</w:t>
+      </w:r>
+      <w:proofErr w:type="spellEnd"/>
+      <w:r>
+        <w:t xml:space="preserve"> biblioteka otvorenog koda (</w:t>
+      </w:r>
+      <w:proofErr w:type="spellStart"/>
+      <w:r>
+        <w:t>eng</w:t>
+      </w:r>
+      <w:proofErr w:type="spellEnd"/>
+      <w:r>
+        <w:t xml:space="preserve">. </w:t>
+      </w:r>
+      <w:proofErr w:type="spellStart"/>
+      <w:r>
+        <w:t>Open</w:t>
+      </w:r>
+      <w:proofErr w:type="spellEnd"/>
+      <w:r>
+        <w:t xml:space="preserve"> </w:t>
+      </w:r>
+      <w:proofErr w:type="spellStart"/>
+      <w:r>
+        <w:t>source</w:t>
+      </w:r>
+      <w:proofErr w:type="spellEnd"/>
+      <w:r>
+        <w:t xml:space="preserve">) koja korisnika daje na raspolaganje veliki broj algoritama mašinskog učenja, specifično algoritama dubokog učenja. Opseg algoritama je širok te uključuje relativno jednostavne algoritme poput </w:t>
+      </w:r>
+      <w:proofErr w:type="spellStart"/>
+      <w:r>
+        <w:t>linear</w:t>
+      </w:r>
+      <w:proofErr w:type="spellEnd"/>
+      <w:r>
+        <w:t xml:space="preserve"> regresije, do </w:t>
+      </w:r>
+      <w:proofErr w:type="spellStart"/>
+      <w:r>
+        <w:t>konvolucionih</w:t>
+      </w:r>
+      <w:proofErr w:type="spellEnd"/>
+      <w:r>
+        <w:t xml:space="preserve"> </w:t>
+      </w:r>
+      <w:proofErr w:type="spellStart"/>
+      <w:r>
+        <w:t>neuralnih</w:t>
+      </w:r>
+      <w:proofErr w:type="spellEnd"/>
+      <w:r>
+        <w:t xml:space="preserve"> mreža te </w:t>
+      </w:r>
+      <w:proofErr w:type="spellStart"/>
+      <w:r>
+        <w:t>transformer</w:t>
+      </w:r>
+      <w:proofErr w:type="spellEnd"/>
+      <w:r>
+        <w:t xml:space="preserve"> modela. Originalno je implementiran od strane Facebook AI Research i konvertovan u biblioteku otvorenog koda u 2017. </w:t>
+      </w:r>
+    </w:p>
+    <w:p>
+      <w:proofErr w:type="spellStart"/>
+      <w:r>
+        <w:t>TorchSharp</w:t>
+      </w:r>
+      <w:proofErr w:type="spellEnd"/>
+      <w:r>
+        <w:t xml:space="preserve"> je .NET biblioteka </w:t>
+      </w:r>
+      <w:proofErr w:type="spellStart"/>
+      <w:r>
+        <w:t>otverenog</w:t>
+      </w:r>
+      <w:proofErr w:type="spellEnd"/>
+      <w:r>
+        <w:t xml:space="preserve"> koda, koja poput </w:t>
+      </w:r>
+      <w:proofErr w:type="spellStart"/>
+      <w:r>
+        <w:t>PyTorch</w:t>
+      </w:r>
+      <w:proofErr w:type="spellEnd"/>
+      <w:r>
+        <w:t xml:space="preserve">, korisnicima daje na raspolaganje jednostavno korištenje raznih algoritama mašinskog učenja. Sam način korištenja biblioteke je vrlo sličan </w:t>
+      </w:r>
+      <w:proofErr w:type="spellStart"/>
+      <w:r>
+        <w:t>Py</w:t>
+      </w:r>
+      <w:r>
+        <w:t>Torch</w:t>
+      </w:r>
+      <w:proofErr w:type="spellEnd"/>
+      <w:r>
+        <w:t xml:space="preserve"> biblioteci.</w:t>
+      </w:r>
+    </w:p>
+    <w:p/>
+    <w:p>
+      <w:pPr>
+        <w:rPr>
+          <w:lang w:val="en-US"/>
+        </w:rPr>
+      </w:pPr>
+      <w:r>
+        <w:t xml:space="preserve">Gledajući malo dublje, obje date biblioteke koriste istu internu logiku koja je implementirana u </w:t>
+      </w:r>
+      <w:proofErr w:type="spellStart"/>
+      <w:r>
+        <w:t>LibTorch</w:t>
+      </w:r>
+      <w:proofErr w:type="spellEnd"/>
+      <w:r>
+        <w:t xml:space="preserve"> biblioteci. </w:t>
+      </w:r>
+      <w:proofErr w:type="spellStart"/>
+      <w:r>
+        <w:t>LibTorch</w:t>
+      </w:r>
+      <w:proofErr w:type="spellEnd"/>
+      <w:r>
+        <w:t xml:space="preserve"> je C</w:t>
+      </w:r>
+      <w:r>
+        <w:rPr>
+          <w:lang w:val="en-GB"/>
+        </w:rPr>
+        <w:t xml:space="preserve">++ </w:t>
+      </w:r>
+      <w:proofErr w:type="spellStart"/>
+      <w:r>
+        <w:rPr>
+          <w:lang w:val="en-GB"/>
+        </w:rPr>
+        <w:t>biblioteka</w:t>
+      </w:r>
+      <w:proofErr w:type="spellEnd"/>
+      <w:r>
+        <w:rPr>
+          <w:lang w:val="en-GB"/>
+        </w:rPr>
+        <w:t xml:space="preserve"> za </w:t>
+      </w:r>
+      <w:proofErr w:type="spellStart"/>
+      <w:r>
+        <w:rPr>
+          <w:lang w:val="en-GB"/>
+        </w:rPr>
+        <w:t>duboko</w:t>
+      </w:r>
+      <w:proofErr w:type="spellEnd"/>
+      <w:r>
+        <w:rPr>
+          <w:lang w:val="en-GB"/>
+        </w:rPr>
+        <w:t xml:space="preserve"> u</w:t>
+      </w:r>
+      <w:proofErr w:type="spellStart"/>
+      <w:r>
+        <w:t>čenje</w:t>
+      </w:r>
+      <w:proofErr w:type="spellEnd"/>
+      <w:r>
+        <w:t xml:space="preserve"> </w:t>
+      </w:r>
+    </w:p>
     <w:p/>
     <w:p/>
     <w:p/>
@@ -2467,14 +2647,11 @@
     <w:p/>
     <w:p/>
     <w:p/>
-    <w:p/>
-    <w:p/>
     <w:p>
       <w:pPr>
         <w:pStyle w:val="Naslov2"/>
       </w:pPr>
       <w:r>
-        <w:lastRenderedPageBreak/>
         <w:t>Metrike modela</w:t>
       </w:r>
     </w:p>
@@ -3061,6 +3238,7 @@
         </w:numPr>
       </w:pPr>
       <w:r>
+        <w:lastRenderedPageBreak/>
         <w:t>Tačnost (eng. Accura</w:t>
       </w:r>
       <w:r>
@@ -3663,6 +3841,7 @@
             <w:rPr>
               <w:rFonts w:ascii="Cambria Math" w:hAnsi="Cambria Math" w:cs="Cambria Math"/>
             </w:rPr>
+            <w:lastRenderedPageBreak/>
             <m:t>Makro Metrika</m:t>
           </m:r>
           <m:r>
@@ -4803,7 +4982,6 @@
         <w:pStyle w:val="Naslov1"/>
       </w:pPr>
       <w:r>
-        <w:lastRenderedPageBreak/>
         <w:t>Metodologija i implementacija</w:t>
       </w:r>
     </w:p>
@@ -5222,7 +5400,6 @@
         <w:pStyle w:val="Naslov2"/>
       </w:pPr>
       <w:r>
-        <w:lastRenderedPageBreak/>
         <w:t>Preprocesiranje slika (</w:t>
       </w:r>
       <w:r>
@@ -11482,7 +11659,7 @@
           <w:lang w:val="de-DE"/>
         </w:rPr>
         <w:drawing>
-          <wp:inline distT="0" distB="0" distL="0" distR="0" wp14:anchorId="3C9F41B0" wp14:editId="21C74E6C">
+          <wp:inline distT="0" distB="0" distL="0" distR="0" wp14:anchorId="3C9F41B0" wp14:editId="23809802">
             <wp:extent cx="5266944" cy="2625594"/>
             <wp:effectExtent l="19050" t="19050" r="10160" b="22860"/>
             <wp:docPr id="1972349067" name="Slika 9"/>

</xml_diff>

<commit_message>
Fixed model overview refreshing.
</commit_message>
<xml_diff>
--- a/Word/1.docx
+++ b/Word/1.docx
@@ -2483,15 +2483,7 @@
       </w:r>
       <w:proofErr w:type="spellEnd"/>
       <w:r>
-        <w:t xml:space="preserve">) koja korisnika daje na raspolaganje veliki broj algoritama mašinskog učenja, specifično algoritama dubokog učenja. Opseg algoritama je širok te uključuje relativno jednostavne algoritme poput </w:t>
-      </w:r>
-      <w:proofErr w:type="spellStart"/>
-      <w:r>
-        <w:t>linear</w:t>
-      </w:r>
-      <w:proofErr w:type="spellEnd"/>
-      <w:r>
-        <w:t xml:space="preserve"> regresije, do </w:t>
+        <w:t xml:space="preserve">) koja korisnicima daje na raspolaganje veliki broj algoritama mašinskog učenja, specifično algoritama dubokog učenja. Opseg algoritama je širok te uključuje relativno jednostavne algoritme poput linearne regresije, do </w:t>
       </w:r>
       <w:proofErr w:type="spellStart"/>
       <w:r>
@@ -2499,15 +2491,7 @@
       </w:r>
       <w:proofErr w:type="spellEnd"/>
       <w:r>
-        <w:t xml:space="preserve"> </w:t>
-      </w:r>
-      <w:proofErr w:type="spellStart"/>
-      <w:r>
-        <w:t>neuralnih</w:t>
-      </w:r>
-      <w:proofErr w:type="spellEnd"/>
-      <w:r>
-        <w:t xml:space="preserve"> mreža te </w:t>
+        <w:t xml:space="preserve"> neuronskih mreža te </w:t>
       </w:r>
       <w:proofErr w:type="spellStart"/>
       <w:r>
@@ -2515,7 +2499,7 @@
       </w:r>
       <w:proofErr w:type="spellEnd"/>
       <w:r>
-        <w:t xml:space="preserve"> modela. Originalno je implementiran od strane Facebook AI Research i konvertovan u biblioteku otvorenog koda u 2017. </w:t>
+        <w:t xml:space="preserve"> modela. Originalno je implementiran od strane Facebook AI Research tima i pretvoren u biblioteku otvorenog koda 2017. godine.</w:t>
       </w:r>
     </w:p>
     <w:p>
@@ -2525,15 +2509,15 @@
       </w:r>
       <w:proofErr w:type="spellEnd"/>
       <w:r>
-        <w:t xml:space="preserve"> je .NET biblioteka </w:t>
-      </w:r>
-      <w:proofErr w:type="spellStart"/>
-      <w:r>
-        <w:t>otverenog</w:t>
-      </w:r>
-      <w:proofErr w:type="spellEnd"/>
-      <w:r>
-        <w:t xml:space="preserve"> koda, koja poput </w:t>
+        <w:t xml:space="preserve"> je .NET biblioteka otvorenog koda, koja, poput </w:t>
+      </w:r>
+      <w:proofErr w:type="spellStart"/>
+      <w:r>
+        <w:t>PyTorcha</w:t>
+      </w:r>
+      <w:proofErr w:type="spellEnd"/>
+      <w:r>
+        <w:t xml:space="preserve">, korisnicima daje na raspolaganje jednostavno korištenje raznih algoritama mašinskog učenja. Sam način korištenja biblioteke je vrlo sličan </w:t>
       </w:r>
       <w:proofErr w:type="spellStart"/>
       <w:r>
@@ -2541,29 +2525,13 @@
       </w:r>
       <w:proofErr w:type="spellEnd"/>
       <w:r>
-        <w:t xml:space="preserve">, korisnicima daje na raspolaganje jednostavno korištenje raznih algoritama mašinskog učenja. Sam način korištenja biblioteke je vrlo sličan </w:t>
-      </w:r>
-      <w:proofErr w:type="spellStart"/>
-      <w:r>
-        <w:t>Py</w:t>
-      </w:r>
-      <w:r>
-        <w:t>Torch</w:t>
-      </w:r>
-      <w:proofErr w:type="spellEnd"/>
-      <w:r>
         <w:t xml:space="preserve"> biblioteci.</w:t>
       </w:r>
     </w:p>
     <w:p/>
     <w:p>
-      <w:pPr>
-        <w:rPr>
-          <w:lang w:val="en-US"/>
-        </w:rPr>
-      </w:pPr>
-      <w:r>
-        <w:t xml:space="preserve">Gledajući malo dublje, obje date biblioteke koriste istu internu logiku koja je implementirana u </w:t>
+      <w:r>
+        <w:t xml:space="preserve">Gledajući dublje, obje navedene biblioteke koriste istu internu logiku koja je implementirana u </w:t>
       </w:r>
       <w:proofErr w:type="spellStart"/>
       <w:r>
@@ -2579,49 +2547,89 @@
       </w:r>
       <w:proofErr w:type="spellEnd"/>
       <w:r>
-        <w:t xml:space="preserve"> je C</w:t>
-      </w:r>
-      <w:r>
-        <w:rPr>
-          <w:lang w:val="en-GB"/>
-        </w:rPr>
-        <w:t xml:space="preserve">++ </w:t>
-      </w:r>
-      <w:proofErr w:type="spellStart"/>
-      <w:r>
-        <w:rPr>
-          <w:lang w:val="en-GB"/>
-        </w:rPr>
-        <w:t>biblioteka</w:t>
-      </w:r>
-      <w:proofErr w:type="spellEnd"/>
-      <w:r>
-        <w:rPr>
-          <w:lang w:val="en-GB"/>
-        </w:rPr>
-        <w:t xml:space="preserve"> za </w:t>
-      </w:r>
-      <w:proofErr w:type="spellStart"/>
-      <w:r>
-        <w:rPr>
-          <w:lang w:val="en-GB"/>
-        </w:rPr>
-        <w:t>duboko</w:t>
-      </w:r>
-      <w:proofErr w:type="spellEnd"/>
-      <w:r>
-        <w:rPr>
-          <w:lang w:val="en-GB"/>
-        </w:rPr>
-        <w:t xml:space="preserve"> u</w:t>
-      </w:r>
-      <w:proofErr w:type="spellStart"/>
-      <w:r>
-        <w:t>čenje</w:t>
-      </w:r>
-      <w:proofErr w:type="spellEnd"/>
-      <w:r>
-        <w:t xml:space="preserve"> </w:t>
+        <w:t xml:space="preserve"> je C++ biblioteka za duboko učenje u kojoj se izvršavaju sve </w:t>
+      </w:r>
+      <w:proofErr w:type="spellStart"/>
+      <w:r>
+        <w:t>tenzorske</w:t>
+      </w:r>
+      <w:proofErr w:type="spellEnd"/>
+      <w:r>
+        <w:t xml:space="preserve"> operacije, automatska diferencijacija i optimizacije. </w:t>
+      </w:r>
+      <w:proofErr w:type="spellStart"/>
+      <w:r>
+        <w:t>LibTorch</w:t>
+      </w:r>
+      <w:proofErr w:type="spellEnd"/>
+      <w:r>
+        <w:t xml:space="preserve"> je implementiran u programskom jeziku C++ jer je za treniranje kompleksnih modela potrebno </w:t>
+      </w:r>
+      <w:proofErr w:type="spellStart"/>
+      <w:r>
+        <w:t>izvršavanje</w:t>
+      </w:r>
+      <w:proofErr w:type="spellEnd"/>
+      <w:r>
+        <w:t xml:space="preserve"> miliona ili triliona operacija svake sekunde, tako da implementacija mora biti veoma efikasna.</w:t>
+      </w:r>
+    </w:p>
+    <w:p>
+      <w:proofErr w:type="spellStart"/>
+      <w:r>
+        <w:t>Python</w:t>
+      </w:r>
+      <w:proofErr w:type="spellEnd"/>
+      <w:r>
+        <w:t>, prema tome, predstavlja samo interfejs za kompleksnu implementaciju u C++ i ne postoji razlog zašto data upotreba ne bi bila moguća u drugim jezicima poput C#. Naprotiv, C# pruža snažno tipiziranu (</w:t>
+      </w:r>
+      <w:proofErr w:type="spellStart"/>
+      <w:r>
+        <w:t>eng</w:t>
+      </w:r>
+      <w:proofErr w:type="spellEnd"/>
+      <w:r>
+        <w:t xml:space="preserve">. </w:t>
+      </w:r>
+      <w:proofErr w:type="spellStart"/>
+      <w:r>
+        <w:t>type</w:t>
+      </w:r>
+      <w:proofErr w:type="spellEnd"/>
+      <w:r>
+        <w:t>-safe) arhitekturu, rješava probleme skalabilnosti eliminacijom GIL-a (</w:t>
+      </w:r>
+      <w:proofErr w:type="spellStart"/>
+      <w:r>
+        <w:t>eng</w:t>
+      </w:r>
+      <w:proofErr w:type="spellEnd"/>
+      <w:r>
+        <w:t xml:space="preserve">. Global Interpreter </w:t>
+      </w:r>
+      <w:proofErr w:type="spellStart"/>
+      <w:r>
+        <w:t>Lock</w:t>
+      </w:r>
+      <w:proofErr w:type="spellEnd"/>
+      <w:r>
+        <w:t xml:space="preserve">) i predstavlja prirodnije </w:t>
+      </w:r>
+      <w:proofErr w:type="spellStart"/>
+      <w:r>
+        <w:t>okruženje</w:t>
+      </w:r>
+      <w:proofErr w:type="spellEnd"/>
+      <w:r>
+        <w:t xml:space="preserve"> za inženjere unutar .NET ekosistema, dok istovremeno </w:t>
+      </w:r>
+      <w:proofErr w:type="spellStart"/>
+      <w:r>
+        <w:t>zadržava</w:t>
+      </w:r>
+      <w:proofErr w:type="spellEnd"/>
+      <w:r>
+        <w:t xml:space="preserve"> identične performanse treniranja.</w:t>
       </w:r>
     </w:p>
     <w:p/>
@@ -2646,7 +2654,6 @@
     <w:p/>
     <w:p/>
     <w:p/>
-    <w:p/>
     <w:p>
       <w:pPr>
         <w:pStyle w:val="Naslov2"/>
@@ -3122,6 +3129,7 @@
         </w:numPr>
       </w:pPr>
       <w:r>
+        <w:lastRenderedPageBreak/>
         <w:t>Preciznost</w:t>
       </w:r>
       <w:r>
@@ -3238,7 +3246,6 @@
         </w:numPr>
       </w:pPr>
       <w:r>
-        <w:lastRenderedPageBreak/>
         <w:t>Tačnost (eng. Accura</w:t>
       </w:r>
       <w:r>
@@ -3672,6 +3679,7 @@
             <w:rPr>
               <w:rFonts w:ascii="Cambria Math" w:hAnsi="Cambria Math" w:cs="Cambria Math"/>
             </w:rPr>
+            <w:lastRenderedPageBreak/>
             <m:t>Tačnost</m:t>
           </m:r>
           <m:r>
@@ -3841,7 +3849,6 @@
             <w:rPr>
               <w:rFonts w:ascii="Cambria Math" w:hAnsi="Cambria Math" w:cs="Cambria Math"/>
             </w:rPr>
-            <w:lastRenderedPageBreak/>
             <m:t>Makro Metrika</m:t>
           </m:r>
           <m:r>
@@ -4377,6 +4384,7 @@
         <w:rPr>
           <w:lang w:val="en-US"/>
         </w:rPr>
+        <w:lastRenderedPageBreak/>
         <w:t xml:space="preserve">Zbog toga se </w:t>
       </w:r>
       <w:proofErr w:type="spellStart"/>
@@ -5356,7 +5364,14 @@
         <w:rPr>
           <w:lang w:val="de-DE"/>
         </w:rPr>
-        <w:t xml:space="preserve"> ukupno 1190 najrelevantnijih slika. Izdvajanje samo ključnih presjeka na kojim</w:t>
+        <w:t xml:space="preserve"> ukupno 1190 najrelevantnijih slika. </w:t>
+      </w:r>
+      <w:r>
+        <w:rPr>
+          <w:lang w:val="de-DE"/>
+        </w:rPr>
+        <w:lastRenderedPageBreak/>
+        <w:t>Izdvajanje samo ključnih presjeka na kojim</w:t>
       </w:r>
       <w:r>
         <w:rPr>
@@ -5786,7 +5801,11 @@
         <w:t>dodavanje dodatnih slika uz određene transformacije na skup podataka.</w:t>
       </w:r>
       <w:r>
-        <w:t xml:space="preserve"> Kako je skup podataka relativno mal</w:t>
+        <w:t xml:space="preserve"> Kako </w:t>
+      </w:r>
+      <w:r>
+        <w:lastRenderedPageBreak/>
+        <w:t>je skup podataka relativno mal</w:t>
       </w:r>
       <w:r>
         <w:t>i</w:t>
@@ -11659,7 +11678,7 @@
           <w:lang w:val="de-DE"/>
         </w:rPr>
         <w:drawing>
-          <wp:inline distT="0" distB="0" distL="0" distR="0" wp14:anchorId="3C9F41B0" wp14:editId="23809802">
+          <wp:inline distT="0" distB="0" distL="0" distR="0" wp14:anchorId="3C9F41B0" wp14:editId="7177E590">
             <wp:extent cx="5266944" cy="2625594"/>
             <wp:effectExtent l="19050" t="19050" r="10160" b="22860"/>
             <wp:docPr id="1972349067" name="Slika 9"/>
@@ -15635,7 +15654,6 @@
   <w:style w:type="character" w:default="1" w:styleId="Zadanifontparagrafa">
     <w:name w:val="Default Paragraph Font"/>
     <w:uiPriority w:val="1"/>
-    <w:semiHidden/>
     <w:unhideWhenUsed/>
   </w:style>
   <w:style w:type="table" w:default="1" w:styleId="Normalnatabela">

</xml_diff>